<commit_message>
feat: Add Hangfire emails, Login Security Alerts, Audit Logging, and XML docs"
</commit_message>
<xml_diff>
--- a/DeployApplication/DeployApplication.docx
+++ b/DeployApplication/DeployApplication.docx
@@ -7323,7 +7323,7 @@
       </w:pPr>
       <w:r>
         <w:pict w14:anchorId="6BC610B1">
-          <v:rect id="_x0000_i1077" style="width:352.5pt;height:.75pt" o:hrpct="0" o:hralign="center" o:hrstd="t" o:hr="t" fillcolor="#a0a0a0" stroked="f"/>
+          <v:rect id="_x0000_i1048" style="width:352.5pt;height:.75pt" o:hrpct="0" o:hralign="center" o:hrstd="t" o:hr="t" fillcolor="#a0a0a0" stroked="f"/>
         </w:pict>
       </w:r>
     </w:p>
@@ -7880,67 +7880,7 @@
                 <w:bdr w:val="single" w:sz="2" w:space="0" w:color="auto" w:frame="1"/>
                 <w:shd w:val="clear" w:color="auto" w:fill="3C3C3C"/>
               </w:rPr>
-              <w:t>wqer</w:t>
-            </w:r>
-            <w:r>
-              <w:rPr>
-                <w:rStyle w:val="HTMLCode"/>
-                <w:rFonts w:ascii="Consolas" w:eastAsiaTheme="minorHAnsi" w:hAnsi="Consolas"/>
-                <w:color w:val="D0D0D0"/>
-                <w:bdr w:val="single" w:sz="2" w:space="0" w:color="auto" w:frame="1"/>
-                <w:shd w:val="clear" w:color="auto" w:fill="3C3C3C"/>
-              </w:rPr>
-              <w:t xml:space="preserve"> </w:t>
-            </w:r>
-            <w:r>
-              <w:rPr>
-                <w:rStyle w:val="HTMLCode"/>
-                <w:rFonts w:ascii="Consolas" w:eastAsiaTheme="minorHAnsi" w:hAnsi="Consolas"/>
-                <w:color w:val="D0D0D0"/>
-                <w:bdr w:val="single" w:sz="2" w:space="0" w:color="auto" w:frame="1"/>
-                <w:shd w:val="clear" w:color="auto" w:fill="3C3C3C"/>
-              </w:rPr>
-              <w:t>yuit</w:t>
-            </w:r>
-            <w:r>
-              <w:rPr>
-                <w:rStyle w:val="HTMLCode"/>
-                <w:rFonts w:ascii="Consolas" w:eastAsiaTheme="minorHAnsi" w:hAnsi="Consolas"/>
-                <w:color w:val="D0D0D0"/>
-                <w:bdr w:val="single" w:sz="2" w:space="0" w:color="auto" w:frame="1"/>
-                <w:shd w:val="clear" w:color="auto" w:fill="3C3C3C"/>
-              </w:rPr>
-              <w:t xml:space="preserve"> </w:t>
-            </w:r>
-            <w:r>
-              <w:rPr>
-                <w:rStyle w:val="HTMLCode"/>
-                <w:rFonts w:ascii="Consolas" w:eastAsiaTheme="minorHAnsi" w:hAnsi="Consolas"/>
-                <w:color w:val="D0D0D0"/>
-                <w:bdr w:val="single" w:sz="2" w:space="0" w:color="auto" w:frame="1"/>
-                <w:shd w:val="clear" w:color="auto" w:fill="3C3C3C"/>
-              </w:rPr>
-              <w:t>fghj</w:t>
-            </w:r>
-            <w:r>
-              <w:rPr>
-                <w:rStyle w:val="HTMLCode"/>
-                <w:rFonts w:ascii="Consolas" w:eastAsiaTheme="minorHAnsi" w:hAnsi="Consolas"/>
-                <w:color w:val="D0D0D0"/>
-                <w:bdr w:val="single" w:sz="2" w:space="0" w:color="auto" w:frame="1"/>
-                <w:shd w:val="clear" w:color="auto" w:fill="3C3C3C"/>
-              </w:rPr>
-              <w:t xml:space="preserve"> </w:t>
-            </w:r>
-            <w:r>
-              <w:rPr>
-                <w:rStyle w:val="HTMLCode"/>
-                <w:rFonts w:ascii="Consolas" w:eastAsiaTheme="minorHAnsi" w:hAnsi="Consolas"/>
-                <w:color w:val="D0D0D0"/>
-                <w:bdr w:val="single" w:sz="2" w:space="0" w:color="auto" w:frame="1"/>
-                <w:shd w:val="clear" w:color="auto" w:fill="3C3C3C"/>
-              </w:rPr>
-              <w:t>erty</w:t>
+              <w:t>wqer yuit fghj erty</w:t>
             </w:r>
           </w:p>
         </w:tc>
@@ -8066,6 +8006,28 @@
           <w:bdr w:val="single" w:sz="2" w:space="0" w:color="auto" w:frame="1"/>
         </w:rPr>
         <w:t> JSON structure on startup).</w:t>
+      </w:r>
+    </w:p>
+    <w:p/>
+    <w:p>
+      <w:r>
+        <w:t>To keep render.com active</w:t>
+      </w:r>
+    </w:p>
+    <w:p>
+      <w:hyperlink r:id="rId5" w:history="1">
+        <w:r>
+          <w:rPr>
+            <w:rStyle w:val="Hyperlink"/>
+          </w:rPr>
+          <w:t>https://uptimerobot.com/</w:t>
+        </w:r>
+      </w:hyperlink>
+    </w:p>
+    <w:p>
+      <w:r>
+        <w:lastRenderedPageBreak/>
+        <w:t>All are sign in using github</w:t>
       </w:r>
     </w:p>
     <w:p/>
@@ -9360,6 +9322,29 @@
       <w:iCs/>
     </w:rPr>
   </w:style>
+  <w:style w:type="character" w:styleId="Hyperlink">
+    <w:name w:val="Hyperlink"/>
+    <w:basedOn w:val="DefaultParagraphFont"/>
+    <w:uiPriority w:val="99"/>
+    <w:unhideWhenUsed/>
+    <w:rsid w:val="00E85179"/>
+    <w:rPr>
+      <w:color w:val="0563C1" w:themeColor="hyperlink"/>
+      <w:u w:val="single"/>
+    </w:rPr>
+  </w:style>
+  <w:style w:type="character" w:styleId="UnresolvedMention">
+    <w:name w:val="Unresolved Mention"/>
+    <w:basedOn w:val="DefaultParagraphFont"/>
+    <w:uiPriority w:val="99"/>
+    <w:semiHidden/>
+    <w:unhideWhenUsed/>
+    <w:rsid w:val="00E85179"/>
+    <w:rPr>
+      <w:color w:val="605E5C"/>
+      <w:shd w:val="clear" w:color="auto" w:fill="E1DFDD"/>
+    </w:rPr>
+  </w:style>
 </w:styles>
 </file>
 

</xml_diff>

<commit_message>
feat(push): add VAPID signature to WebPushService for closed-app lock screen notifications
- Upgrade WebPushService with WebPushClient & VapidDetails encryption engine
- Sign push payloads dynamically to comply with Apple APNs & Google FCM authentication specs
- Ensure push banners appear when HealSync app is closed or switched on iOS/Android devices
- Update deployment documentation
</commit_message>
<xml_diff>
--- a/DeployApplication/DeployApplication.docx
+++ b/DeployApplication/DeployApplication.docx
@@ -8030,6 +8030,23 @@
         <w:t>All are sign in using github</w:t>
       </w:r>
     </w:p>
+    <w:p/>
+    <w:p>
+      <w:r>
+        <w:t>Use below link to send email because Render.com block the email ports</w:t>
+      </w:r>
+    </w:p>
+    <w:p>
+      <w:hyperlink r:id="rId6" w:history="1">
+        <w:r>
+          <w:rPr>
+            <w:rStyle w:val="Hyperlink"/>
+          </w:rPr>
+          <w:t>https://www.brevo.com/</w:t>
+        </w:r>
+      </w:hyperlink>
+    </w:p>
+    <w:p/>
     <w:p/>
     <w:sectPr>
       <w:pgSz w:w="12240" w:h="15840"/>

</xml_diff>